<commit_message>
feat: integrate grand forest lake into mainscene, separate dual lake scenes, and remove 3D grass
</commit_message>
<xml_diff>
--- a/doc/Asset & Model.docx
+++ b/doc/Asset & Model.docx
@@ -33,7 +33,6 @@
           <w:szCs w:val="40"/>
         </w:rPr>
       </w:pPr>
-      <w:bookmarkStart w:id="0" w:name="_GoBack"/>
       <w:r>
         <w:rPr>
           <w:rFonts w:hint="default" w:ascii="Times New Roman" w:hAnsi="Times New Roman" w:eastAsia="SimSun" w:cs="Times New Roman"/>
@@ -60,7 +59,6 @@
         <w:t>Model</w:t>
       </w:r>
     </w:p>
-    <w:bookmarkEnd w:id="0"/>
     <w:p>
       <w:pPr>
         <w:numPr>
@@ -102,6 +100,7 @@
     <w:p>
       <w:pPr>
         <w:numPr>
+          <w:ilvl w:val="0"/>
           <w:numId w:val="0"/>
         </w:numPr>
         <w:jc w:val="both"/>
@@ -292,6 +291,31 @@
         <w:ind w:left="720"/>
         <w:rPr>
           <w:rFonts w:hint="default" w:ascii="Times New Roman" w:hAnsi="Times New Roman" w:cs="Times New Roman"/>
+          <w:b/>
+          <w:bCs/>
+          <w:lang w:val="en-US"/>
+        </w:rPr>
+      </w:pPr>
+      <w:r>
+        <w:rPr>
+          <w:rFonts w:hint="default" w:cs="Times New Roman"/>
+          <w:b/>
+          <w:bCs/>
+          <w:lang w:val="en-US"/>
+        </w:rPr>
+        <w:t>Trời có mây</w:t>
+      </w:r>
+    </w:p>
+    <w:p>
+      <w:pPr>
+        <w:pStyle w:val="6"/>
+        <w:keepNext w:val="0"/>
+        <w:keepLines w:val="0"/>
+        <w:widowControl/>
+        <w:suppressLineNumbers w:val="0"/>
+        <w:ind w:left="720"/>
+        <w:rPr>
+          <w:rFonts w:hint="default" w:ascii="Times New Roman" w:hAnsi="Times New Roman" w:cs="Times New Roman"/>
         </w:rPr>
       </w:pPr>
     </w:p>
@@ -312,6 +336,8 @@
         </w:rPr>
         <w:t>Kiến trúc (Structures)</w:t>
       </w:r>
+      <w:bookmarkStart w:id="0" w:name="_GoBack"/>
+      <w:bookmarkEnd w:id="0"/>
     </w:p>
     <w:p>
       <w:pPr>
@@ -458,6 +484,7 @@
         <w:keepLines w:val="0"/>
         <w:widowControl/>
         <w:numPr>
+          <w:ilvl w:val="0"/>
           <w:numId w:val="0"/>
         </w:numPr>
         <w:suppressLineNumbers w:val="0"/>
@@ -484,6 +511,7 @@
         <w:keepLines w:val="0"/>
         <w:widowControl/>
         <w:numPr>
+          <w:ilvl w:val="0"/>
           <w:numId w:val="0"/>
         </w:numPr>
         <w:suppressLineNumbers w:val="0"/>
@@ -2020,6 +2048,7 @@
         <w:keepLines w:val="0"/>
         <w:widowControl/>
         <w:numPr>
+          <w:ilvl w:val="0"/>
           <w:numId w:val="0"/>
         </w:numPr>
         <w:suppressLineNumbers w:val="0"/>
@@ -2115,6 +2144,7 @@
         <w:keepLines w:val="0"/>
         <w:widowControl/>
         <w:numPr>
+          <w:ilvl w:val="0"/>
           <w:numId w:val="0"/>
         </w:numPr>
         <w:suppressLineNumbers w:val="0"/>
@@ -2133,6 +2163,7 @@
         <w:keepLines w:val="0"/>
         <w:widowControl/>
         <w:numPr>
+          <w:ilvl w:val="0"/>
           <w:numId w:val="0"/>
         </w:numPr>
         <w:suppressLineNumbers w:val="0"/>
@@ -2161,6 +2192,7 @@
         <w:keepLines w:val="0"/>
         <w:widowControl/>
         <w:numPr>
+          <w:ilvl w:val="0"/>
           <w:numId w:val="0"/>
         </w:numPr>
         <w:suppressLineNumbers w:val="0"/>
@@ -2173,6 +2205,7 @@
     <w:p>
       <w:pPr>
         <w:numPr>
+          <w:ilvl w:val="0"/>
           <w:numId w:val="0"/>
         </w:numPr>
         <w:jc w:val="both"/>
@@ -2342,11 +2375,11 @@
     <w:lsdException w:unhideWhenUsed="0" w:uiPriority="0" w:semiHidden="0" w:name="Document Map"/>
     <w:lsdException w:unhideWhenUsed="0" w:uiPriority="0" w:semiHidden="0" w:name="Plain Text"/>
     <w:lsdException w:unhideWhenUsed="0" w:uiPriority="0" w:semiHidden="0" w:name="E-mail Signature"/>
-    <w:lsdException w:unhideWhenUsed="0" w:uiPriority="0" w:semiHidden="0" w:name="Normal (Web)"/>
+    <w:lsdException w:qFormat="1" w:unhideWhenUsed="0" w:uiPriority="0" w:semiHidden="0" w:name="Normal (Web)"/>
     <w:lsdException w:unhideWhenUsed="0" w:uiPriority="0" w:semiHidden="0" w:name="HTML Acronym"/>
     <w:lsdException w:unhideWhenUsed="0" w:uiPriority="0" w:semiHidden="0" w:name="HTML Address"/>
     <w:lsdException w:unhideWhenUsed="0" w:uiPriority="0" w:semiHidden="0" w:name="HTML Cite"/>
-    <w:lsdException w:unhideWhenUsed="0" w:uiPriority="0" w:semiHidden="0" w:name="HTML Code"/>
+    <w:lsdException w:qFormat="1" w:unhideWhenUsed="0" w:uiPriority="0" w:semiHidden="0" w:name="HTML Code"/>
     <w:lsdException w:unhideWhenUsed="0" w:uiPriority="0" w:semiHidden="0" w:name="HTML Definition"/>
     <w:lsdException w:unhideWhenUsed="0" w:uiPriority="0" w:semiHidden="0" w:name="HTML Keyboard"/>
     <w:lsdException w:unhideWhenUsed="0" w:uiPriority="0" w:semiHidden="0" w:name="HTML Preformatted"/>
@@ -2552,6 +2585,7 @@
   <w:style w:type="character" w:styleId="5">
     <w:name w:val="HTML Code"/>
     <w:basedOn w:val="3"/>
+    <w:qFormat/>
     <w:uiPriority w:val="0"/>
     <w:rPr>
       <w:rFonts w:ascii="Courier New" w:hAnsi="Courier New" w:cs="Courier New"/>
@@ -2561,6 +2595,7 @@
   </w:style>
   <w:style w:type="paragraph" w:styleId="6">
     <w:name w:val="Normal (Web)"/>
+    <w:qFormat/>
     <w:uiPriority w:val="0"/>
     <w:pPr>
       <w:spacing w:before="0" w:beforeAutospacing="1" w:after="0" w:afterAutospacing="1"/>
@@ -2568,6 +2603,7 @@
       <w:jc w:val="left"/>
     </w:pPr>
     <w:rPr>
+      <w:rFonts w:ascii="Times New Roman" w:hAnsi="Times New Roman" w:eastAsia="SimSun" w:cs="Times New Roman"/>
       <w:kern w:val="0"/>
       <w:sz w:val="24"/>
       <w:szCs w:val="24"/>

</xml_diff>